<commit_message>
Poprawki przed zajeciami 4: link do repo, naprawa bledu nadpisywania zmiennych w diagramie, weryfikacje jakosciowe
</commit_message>
<xml_diff>
--- a/RAPORTY/Raport_1_zdefiniowanie_problemu_i_hipotez.docx
+++ b/RAPORTY/Raport_1_zdefiniowanie_problemu_i_hipotez.docx
@@ -404,13 +404,7 @@
         <w:spacing w:after="60" w:line="276" w:lineRule="auto"/>
       </w:pPr>
       <w:r>
-        <w:rPr>
-          <w:b/>
-        </w:rPr>
-        <w:t xml:space="preserve">Postawienie i sformalizowanie hipotez badawczych: </w:t>
-      </w:r>
-      <w:r>
-        <w:t>zdefiniowano trzy hipotezy (H1: sygnały behawioralne, H2: przewaga LSTM nad XGBoost, H3: 3-etapowy wzorzec kryzysu) wraz z precyzyjną metodologią ich statystycznej weryfikacji.</w:t>
+        <w:t>Postawienie i sformalizowanie hipotez badawczych: zdefiniowano cztery hipotezy (H1–H4) (H1: sygnały behawioralne, H2: przewaga LSTM nad XGBoost, H3: 3-etapowy wzorzec kryzysu) wraz z precyzyjną metodologią ich statystycznej weryfikacji.</w:t>
       </w:r>
     </w:p>
     <w:p>

</xml_diff>